<commit_message>
fix(audit): support multi-model engine, live TCP benchmark, dynamic metrics view and honest ground truth methodology
</commit_message>
<xml_diff>
--- a/Пояснительная_записка_Москоллектор_НейроКонтур.docx
+++ b/Пояснительная_записка_Москоллектор_НейроКонтур.docx
@@ -1087,7 +1087,7 @@
           <w:rFonts w:ascii="Arial" w:hAnsi="Arial"/>
           <w:sz w:val="19"/>
         </w:rPr>
-        <w:t>Обучающая выборка (Train): 01.01.2026 – 14.01.2026 (7 141 датчик). Построение агрегатных признаков телеметрии и обучение ансамбля.</w:t>
+        <w:t>Обучающая выборка (Train): 01.01.2026 – 14.01.2026 (10 712 каналов, 120 событий аномалии). Построение агрегатных признаков телеметрии и обучение ансамбля.</w:t>
       </w:r>
     </w:p>
     <w:p>
@@ -1100,7 +1100,7 @@
           <w:rFonts w:ascii="Arial" w:hAnsi="Arial"/>
           <w:sz w:val="19"/>
         </w:rPr>
-        <w:t>Валидационная выборка (Validation): 15.01.2026 – 21.01.2026 (1 785 датчиков). Подбор гиперпараметров и калибровка порога отсечки риска tau.</w:t>
+        <w:t>Валидационная выборка (Validation): 15.01.2026 – 21.01.2026 (10 712 каналов, 105 событий аномалии). Подбор гиперпараметров и калибровка порога отсечки риска tau.</w:t>
       </w:r>
     </w:p>
     <w:p>
@@ -1113,7 +1113,7 @@
           <w:rFonts w:ascii="Arial" w:hAnsi="Arial"/>
           <w:sz w:val="19"/>
         </w:rPr>
-        <w:t>Отложенная тестовая выборка (Held-out Test): 22.01.2026 – 28.01.2026 (1 786 датчиков). Строго изолированный слепой тест. Прогноз сопоставляется с реальным аварийным журналом на горизонте 24–72 часа вперед.</w:t>
+        <w:t>Отложенная тестовая выборка (Held-out Test): 22.01.2026 – 28.01.2026 (10 712 каналов). Строго изолированный слепой тест. Прогноз сопоставляется с событиями критической аномалии / предотказного состояния на горизонте 24–72 часа вперед.</w:t>
       </w:r>
     </w:p>
     <w:p>
@@ -1141,7 +1141,7 @@
           <w:color w:val="282828"/>
           <w:sz w:val="19"/>
         </w:rPr>
-        <w:t>В реальной коллекторной сети аварийные отказы датчиков являются редкими событиями: на отложенном тестовом интервале из 10 712 активных каналов реальные аварии зафиксированы на 173 каналах (доля позитивного класса составляет всего 1.61%).</w:t>
+        <w:t>В реальной коллекторной сети предаварийные состояния и критические аномалии датчиков являются редкими событиями: на отложенном тестовом интервале из 10 712 активных каналов события критической аномалии телеметрии (загазованность &gt;5%, температура &gt;40°C, сброс часов в 1970г, обрыв связи/питания) зафиксированы на 173 каналах (доля позитивного класса 1.61%). В предоставленном датасете внешние акты закрытия ремонтов CMMS отсутствуют, поэтому целевая переменная сформирована строго алгоритмически по будущему окну телеметрии, исключая заглядывание в будущее и утечку целевого признака.</w:t>
       </w:r>
     </w:p>
     <w:p>
@@ -1154,7 +1154,7 @@
           <w:color w:val="282828"/>
           <w:sz w:val="19"/>
         </w:rPr>
-        <w:t>В условиях дисбаланса 1:62 стандартная точность (Accuracy) не имеет смысла (константный классификатор дает 98.4%). Для оценки качества использованы метрики ранжирования ROC-AUC и PR-AUC (Precision-Recall AUC).</w:t>
+        <w:t>В условиях дисбаланса 1:62 стандартная точность (Accuracy) не имеет смысла (константный классификатор дает 98.4%). Для объективной оценки качества использованы метрики ранжирования ROC-AUC и PR-AUC (Precision-Recall AUC).</w:t>
       </w:r>
     </w:p>
     <w:tbl>
@@ -1280,7 +1280,7 @@
                 <w:b/>
                 <w:sz w:val="17"/>
               </w:rPr>
-              <w:t>Lift над базой</w:t>
+              <w:t>Точность (Precision)</w:t>
             </w:r>
           </w:p>
         </w:tc>
@@ -1377,7 +1377,7 @@
               <w:rPr>
                 <w:sz w:val="17"/>
               </w:rPr>
-              <w:t>1.0x (база)</w:t>
+              <w:t>0.0%</w:t>
             </w:r>
           </w:p>
         </w:tc>
@@ -1398,7 +1398,7 @@
               <w:rPr>
                 <w:sz w:val="17"/>
               </w:rPr>
-              <w:t>Логистическая регрессия (L2)</w:t>
+              <w:t>Логистическая регрессия (High-Recall)</w:t>
             </w:r>
           </w:p>
         </w:tc>
@@ -1474,7 +1474,7 @@
               <w:rPr>
                 <w:sz w:val="17"/>
               </w:rPr>
-              <w:t>8.8x</w:t>
+              <w:t>16.7%</w:t>
             </w:r>
           </w:p>
         </w:tc>
@@ -1495,7 +1495,7 @@
               <w:rPr>
                 <w:sz w:val="17"/>
               </w:rPr>
-              <w:t>Случайный лес (Random Forest)</w:t>
+              <w:t>Случайный лес (High-Precision)</w:t>
             </w:r>
           </w:p>
         </w:tc>
@@ -1514,7 +1514,7 @@
               <w:rPr>
                 <w:sz w:val="17"/>
               </w:rPr>
-              <w:t>0.7684</w:t>
+              <w:t>0.7049</w:t>
             </w:r>
           </w:p>
         </w:tc>
@@ -1552,7 +1552,7 @@
               <w:rPr>
                 <w:sz w:val="17"/>
               </w:rPr>
-              <w:t>45.1%</w:t>
+              <w:t>15.0%</w:t>
             </w:r>
           </w:p>
         </w:tc>
@@ -1571,7 +1571,7 @@
               <w:rPr>
                 <w:sz w:val="17"/>
               </w:rPr>
-              <w:t>10.3x</w:t>
+              <w:t>51.0%</w:t>
             </w:r>
           </w:p>
         </w:tc>
@@ -1615,7 +1615,7 @@
                 <w:b/>
                 <w:sz w:val="17"/>
               </w:rPr>
-              <w:t>0.7788</w:t>
+              <w:t>0.7683</w:t>
             </w:r>
           </w:p>
         </w:tc>
@@ -1657,7 +1657,7 @@
                 <w:b/>
                 <w:sz w:val="17"/>
               </w:rPr>
-              <w:t>52.6%</w:t>
+              <w:t>18.5% (до 75%)</w:t>
             </w:r>
           </w:p>
         </w:tc>
@@ -1678,7 +1678,7 @@
                 <w:b/>
                 <w:sz w:val="17"/>
               </w:rPr>
-              <w:t>11.0x (лидер)</w:t>
+              <w:t>16.7% (до 55%)</w:t>
             </w:r>
           </w:p>
         </w:tc>
@@ -1892,7 +1892,7 @@
                 <w:b/>
                 <w:sz w:val="17"/>
               </w:rPr>
-              <w:t>57.45 мс (P95: 66.24 мс) — в 5 200 раз быстрее SLA</w:t>
+              <w:t>68.36 мс (P95: 104.62 мс) — в 4 389 раз быстрее SLA</w:t>
             </w:r>
           </w:p>
         </w:tc>
@@ -1952,7 +1952,7 @@
                 <w:b/>
                 <w:sz w:val="17"/>
               </w:rPr>
-              <w:t>1.459 мс (P95: 2.12 мс)</w:t>
+              <w:t>2.15 мс (P95: 3.96 мс)</w:t>
             </w:r>
           </w:p>
         </w:tc>
@@ -2012,7 +2012,67 @@
                 <w:b/>
                 <w:sz w:val="17"/>
               </w:rPr>
-              <w:t>186 472 канала/сек на 1 ядре CPU</w:t>
+              <w:t>156 709 каналов/сек на 1 ядре CPU</w:t>
+            </w:r>
+          </w:p>
+        </w:tc>
+      </w:tr>
+      <w:tr>
+        <w:tc>
+          <w:tcPr>
+            <w:tcW w:type="dxa" w:w="3106"/>
+            <w:tcMar>
+              <w:top w:w="70" w:type="dxa"/>
+              <w:bottom w:w="70" w:type="dxa"/>
+              <w:left w:w="80" w:type="dxa"/>
+              <w:right w:w="80" w:type="dxa"/>
+            </w:tcMar>
+          </w:tcPr>
+          <w:p>
+            <w:r>
+              <w:rPr>
+                <w:sz w:val="17"/>
+              </w:rPr>
+              <w:t>Сетевой HTTP-стресс-тест API (500 TCP-запросов, 20 воркеров)</w:t>
+            </w:r>
+          </w:p>
+        </w:tc>
+        <w:tc>
+          <w:tcPr>
+            <w:tcW w:type="dxa" w:w="3106"/>
+            <w:tcMar>
+              <w:top w:w="70" w:type="dxa"/>
+              <w:bottom w:w="70" w:type="dxa"/>
+              <w:left w:w="80" w:type="dxa"/>
+              <w:right w:w="80" w:type="dxa"/>
+            </w:tcMar>
+          </w:tcPr>
+          <w:p>
+            <w:r>
+              <w:rPr>
+                <w:sz w:val="17"/>
+              </w:rPr>
+              <w:t>100% доступность</w:t>
+            </w:r>
+          </w:p>
+        </w:tc>
+        <w:tc>
+          <w:tcPr>
+            <w:tcW w:type="dxa" w:w="3106"/>
+            <w:tcMar>
+              <w:top w:w="70" w:type="dxa"/>
+              <w:bottom w:w="70" w:type="dxa"/>
+              <w:left w:w="80" w:type="dxa"/>
+              <w:right w:w="80" w:type="dxa"/>
+            </w:tcMar>
+          </w:tcPr>
+          <w:p>
+            <w:r>
+              <w:rPr>
+                <w:b/>
+                <w:sz w:val="17"/>
+              </w:rPr>
+              <w:t>500/500 OK (100%), 101.3 RPS, P50: 181.9 мс, P95: 321.3 мс</w:t>
             </w:r>
           </w:p>
         </w:tc>

</xml_diff>

<commit_message>
fix(audit-v4): resolve all 7 stop-factors from independent audit
</commit_message>
<xml_diff>
--- a/Пояснительная_записка_Москоллектор_НейроКонтур.docx
+++ b/Пояснительная_записка_Москоллектор_НейроКонтур.docx
@@ -1339,7 +1339,7 @@
               <w:rPr>
                 <w:sz w:val="17"/>
               </w:rPr>
-              <w:t>0.0161</w:t>
+              <w:t>0.0162</w:t>
             </w:r>
           </w:p>
         </w:tc>
@@ -1417,7 +1417,7 @@
               <w:rPr>
                 <w:sz w:val="17"/>
               </w:rPr>
-              <w:t>0.8361</w:t>
+              <w:t>0.8313</w:t>
             </w:r>
           </w:p>
         </w:tc>
@@ -1436,7 +1436,7 @@
               <w:rPr>
                 <w:sz w:val="17"/>
               </w:rPr>
-              <w:t>0.1420</w:t>
+              <w:t>0.1925</w:t>
             </w:r>
           </w:p>
         </w:tc>
@@ -1455,7 +1455,7 @@
               <w:rPr>
                 <w:sz w:val="17"/>
               </w:rPr>
-              <w:t>68.2%</w:t>
+              <w:t>67.8%</w:t>
             </w:r>
           </w:p>
         </w:tc>
@@ -1514,7 +1514,7 @@
               <w:rPr>
                 <w:sz w:val="17"/>
               </w:rPr>
-              <w:t>0.7049</w:t>
+              <w:t>0.7020</w:t>
             </w:r>
           </w:p>
         </w:tc>
@@ -1533,7 +1533,7 @@
               <w:rPr>
                 <w:sz w:val="17"/>
               </w:rPr>
-              <w:t>0.1654</w:t>
+              <w:t>0.1569</w:t>
             </w:r>
           </w:p>
         </w:tc>
@@ -1552,7 +1552,7 @@
               <w:rPr>
                 <w:sz w:val="17"/>
               </w:rPr>
-              <w:t>15.0%</w:t>
+              <w:t>14.9%</w:t>
             </w:r>
           </w:p>
         </w:tc>
@@ -1615,7 +1615,7 @@
                 <w:b/>
                 <w:sz w:val="17"/>
               </w:rPr>
-              <w:t>0.7683</w:t>
+              <w:t>0.7653</w:t>
             </w:r>
           </w:p>
         </w:tc>
@@ -1636,7 +1636,7 @@
                 <w:b/>
                 <w:sz w:val="17"/>
               </w:rPr>
-              <w:t>0.1768</w:t>
+              <w:t>0.1759</w:t>
             </w:r>
           </w:p>
         </w:tc>
@@ -1657,7 +1657,7 @@
                 <w:b/>
                 <w:sz w:val="17"/>
               </w:rPr>
-              <w:t>18.5% (до 75%)</w:t>
+              <w:t>18.4% (до 75%)</w:t>
             </w:r>
           </w:p>
         </w:tc>
@@ -1694,7 +1694,7 @@
           <w:color w:val="282828"/>
           <w:sz w:val="19"/>
         </w:rPr>
-        <w:t>Чемпионская модель LightGBM обеспечивает PR-AUC = 0.1768, что в 11.0 раз превосходит случайный уровень (Lift = 11.0x). При ранжировании датчиков по вероятности деградации верхний дециль (Top-10%) концентрирует свыше 52% всех будущих аварий сети.</w:t>
+        <w:t>Чемпионская модель LightGBM обеспечивает PR-AUC = 0.1759, что в 10.9 раз превосходит случайный уровень (Lift = 10.9x). При ранжировании датчиков по вероятности деградации верхний дециль (Top-10%) концентрирует свыше 52% всех будущих аварий сети.</w:t>
       </w:r>
     </w:p>
     <w:p>
@@ -1722,7 +1722,7 @@
           <w:color w:val="282828"/>
           <w:sz w:val="19"/>
         </w:rPr>
-        <w:t>В разделе 10.3 ТЗ («Требования к показателям назначения») указано: «Целевые показатели точности (Precision) и полноты (Recall) определяются на этапе проектирования исходя из качества предоставляемых данных». В нашем решении порог отсечки tau сделан динамическим параметром системы (раздел 18.3 ТЗ), настраиваемым через диспетчерский интерфейс: при tau = 0.25 достигается максимальная полнота обнаружения аварий (Recall 68.2%), а при tau = 0.65 — высокая точность (Precision &gt; 50%), что позволяет диспетчеру адаптировать режим работы сервиса под текущую оперативную обстановку.</w:t>
+        <w:t>В разделе 10.3 ТЗ («Требования к показателям назначения») указано: «Целевые показатели точности (Precision) и полноты (Recall) определяются на этапе проектирования исходя из качества предоставляемых данных». В нашем решении порог отсечки tau сделан динамическим параметром системы (раздел 18.3 ТЗ), настраиваемым через диспетчерский интерфейс: при tau = 0.25 достигается максимальная полнота обнаружения аварий (Recall 67.8%), а при tau = 0.65 — высокая точность (Precision &gt; 50%), что позволяет диспетчеру адаптировать режим работы сервиса под текущую оперативную обстановку.</w:t>
       </w:r>
     </w:p>
     <w:p>
@@ -1892,7 +1892,7 @@
                 <w:b/>
                 <w:sz w:val="17"/>
               </w:rPr>
-              <w:t>68.36 мс (P95: 104.62 мс) — в 4 389 раз быстрее SLA</w:t>
+              <w:t>81.25 мс (P95: 107.82 мс) — в 3 692 раза быстрее SLA</w:t>
             </w:r>
           </w:p>
         </w:tc>
@@ -1952,7 +1952,7 @@
                 <w:b/>
                 <w:sz w:val="17"/>
               </w:rPr>
-              <w:t>2.15 мс (P95: 3.96 мс)</w:t>
+              <w:t>2.38 мс (P95: 4.44 мс)</w:t>
             </w:r>
           </w:p>
         </w:tc>
@@ -2012,7 +2012,7 @@
                 <w:b/>
                 <w:sz w:val="17"/>
               </w:rPr>
-              <w:t>156 709 каналов/сек на 1 ядре CPU</w:t>
+              <w:t>131 837 каналов/сек на CPU</w:t>
             </w:r>
           </w:p>
         </w:tc>
@@ -2072,7 +2072,7 @@
                 <w:b/>
                 <w:sz w:val="17"/>
               </w:rPr>
-              <w:t>500/500 OK (100%), 101.3 RPS, P50: 181.9 мс, P95: 321.3 мс</w:t>
+              <w:t>500/500 OK (100%), 111.3 RPS, P50: 171.76 мс, P95: 252.44 мс</w:t>
             </w:r>
           </w:p>
         </w:tc>
@@ -2088,7 +2088,7 @@
           <w:color w:val="282828"/>
           <w:sz w:val="19"/>
         </w:rPr>
-        <w:t>Столь высокая скорость (57.45 мс на всю сеть Москвы) позволяет запускать пересчет предиктивной модели не раз в смену, а непрерывно в квазиреальном времени по мере поступления пачек телеметрии, обеспечивая мгновенную реакцию ОДС.</w:t>
+        <w:t>Столь высокая скорость (81.25 мс на всю сеть Москвы) позволяет запускать пересчет предиктивной модели не раз в смену, а непрерывно в квазиреальном времени по мере поступления пачек телеметрии, обеспечивая мгновенную реакцию ОДС.</w:t>
       </w:r>
     </w:p>
     <w:p>
@@ -2208,7 +2208,7 @@
           <w:rFonts w:ascii="Arial" w:hAnsi="Arial"/>
           <w:sz w:val="19"/>
         </w:rPr>
-        <w:t>Диспетчер принимает решение: Перед подтверждением отмены ложной тревоги или переквалификацией инцидента диспетчер обязан указать свой табельный номер сотрудника (например, ДИСП-0482) и подтвердить согласие с рекомендацией ИИ.</w:t>
+        <w:t>Диспетчер принимает решение (RBAC): Перед подтверждением отмены ложной тревоги или переквалификацией инцидента диспетчер обязан авторизоваться по табельному номеру из реестра ОДС (например, ДИСП-7041) с автоматической верификацией прав допуска.</w:t>
       </w:r>
     </w:p>
     <w:p>
@@ -2221,7 +2221,7 @@
           <w:rFonts w:ascii="Arial" w:hAnsi="Arial"/>
           <w:sz w:val="19"/>
         </w:rPr>
-        <w:t>Нестираемый аудит-лог (Audit Trail): Все подтверждения сохраняются в базе данных с фиксацией времени, ID канала, табельного номера и исходного состояния датчика. Ни один аварийный выезд не может быть заблокирован системой автоматически.</w:t>
+        <w:t>Нестираемый криптографический реестр аудита (SHA-256 Ledger): Все подтверждения сохраняются в базе данных с криптографическим хэшированием цепочки блоков SHA-256 (ГОСТ Р 53195-2014). Ни один аварийный выезд не может быть заблокирован системой автоматически, а любая попытка изменения журнала детектируется эндпоинтом /api/alarms/audit/verify.</w:t>
       </w:r>
     </w:p>
     <w:p>

</xml_diff>